<commit_message>
created ASP.NET Core Web API app and 'Events' controller
</commit_message>
<xml_diff>
--- a/Documents/Race Day Plan.docx
+++ b/Documents/Race Day Plan.docx
@@ -12,6 +12,7 @@
         <w:pStyle w:val="Heading1"/>
       </w:pPr>
       <w:r>
+        <w:lastRenderedPageBreak/>
         <w:t xml:space="preserve">Section A </w:t>
       </w:r>
       <w:r>
@@ -23,10 +24,11 @@
         <w:rPr>
           <w:noProof/>
         </w:rPr>
+        <w:lastRenderedPageBreak/>
         <w:drawing>
-          <wp:inline distT="0" distB="0" distL="0" distR="0" wp14:anchorId="0D4E9E7B" wp14:editId="217F2EE0">
-            <wp:extent cx="5731510" cy="6097905"/>
-            <wp:effectExtent l="0" t="0" r="2540" b="0"/>
+          <wp:inline distT="0" distB="0" distL="0" distR="0" wp14:anchorId="0D4E9E7B" wp14:editId="0E248774">
+            <wp:extent cx="9229060" cy="6097905"/>
+            <wp:effectExtent l="0" t="0" r="0" b="0"/>
             <wp:docPr id="1664621083" name="Picture 1"/>
             <wp:cNvGraphicFramePr>
               <a:graphicFrameLocks xmlns:a="http://schemas.openxmlformats.org/drawingml/2006/main" noChangeAspect="1"/>
@@ -53,7 +55,7 @@
                   <pic:spPr>
                     <a:xfrm>
                       <a:off x="0" y="0"/>
-                      <a:ext cx="5731510" cy="6097905"/>
+                      <a:ext cx="9241176" cy="6105910"/>
                     </a:xfrm>
                     <a:prstGeom prst="rect">
                       <a:avLst/>
@@ -65,12 +67,16 @@
           </wp:inline>
         </w:drawing>
       </w:r>
+      <w:r>
+        <w:br w:type="page"/>
+      </w:r>
     </w:p>
     <w:p>
       <w:pPr>
         <w:pStyle w:val="Heading1"/>
       </w:pPr>
       <w:r>
+        <w:lastRenderedPageBreak/>
         <w:t>Section B – API Endpoint Plan</w:t>
       </w:r>
     </w:p>
@@ -196,10 +202,7 @@
             </w:r>
             <w:proofErr w:type="spellEnd"/>
             <w:r>
-              <w:t>/auth/</w:t>
-            </w:r>
-            <w:r>
-              <w:t>register</w:t>
+              <w:t>/auth/register</w:t>
             </w:r>
           </w:p>
         </w:tc>
@@ -399,7 +402,15 @@
           </w:tcPr>
           <w:p>
             <w:r>
-              <w:t>View logged in users profile</w:t>
+              <w:t xml:space="preserve">View logged in </w:t>
+            </w:r>
+            <w:proofErr w:type="gramStart"/>
+            <w:r>
+              <w:t>users</w:t>
+            </w:r>
+            <w:proofErr w:type="gramEnd"/>
+            <w:r>
+              <w:t xml:space="preserve"> profile</w:t>
             </w:r>
           </w:p>
         </w:tc>
@@ -479,7 +490,15 @@
           </w:tcPr>
           <w:p>
             <w:r>
-              <w:t>Update logged in users profile</w:t>
+              <w:t xml:space="preserve">Update logged in </w:t>
+            </w:r>
+            <w:proofErr w:type="gramStart"/>
+            <w:r>
+              <w:t>users</w:t>
+            </w:r>
+            <w:proofErr w:type="gramEnd"/>
+            <w:r>
+              <w:t xml:space="preserve"> profile</w:t>
             </w:r>
           </w:p>
         </w:tc>
@@ -949,6 +968,7 @@
           </w:tcPr>
           <w:p>
             <w:r>
+              <w:lastRenderedPageBreak/>
               <w:t>Event Types</w:t>
             </w:r>
           </w:p>
@@ -1234,10 +1254,12 @@
               <w:t>/</w:t>
             </w:r>
             <w:proofErr w:type="spellStart"/>
+            <w:proofErr w:type="gramStart"/>
             <w:r>
               <w:t>api</w:t>
             </w:r>
             <w:proofErr w:type="spellEnd"/>
+            <w:proofErr w:type="gramEnd"/>
             <w:r>
               <w:t>/events/{</w:t>
             </w:r>
@@ -1324,10 +1346,12 @@
               <w:t>/</w:t>
             </w:r>
             <w:proofErr w:type="spellStart"/>
+            <w:proofErr w:type="gramStart"/>
             <w:r>
               <w:t>api</w:t>
             </w:r>
             <w:proofErr w:type="spellEnd"/>
+            <w:proofErr w:type="gramEnd"/>
             <w:r>
               <w:t>/events/{</w:t>
             </w:r>
@@ -1412,10 +1436,12 @@
               <w:t>/</w:t>
             </w:r>
             <w:proofErr w:type="spellStart"/>
+            <w:proofErr w:type="gramStart"/>
             <w:r>
               <w:t>api</w:t>
             </w:r>
             <w:proofErr w:type="spellEnd"/>
+            <w:proofErr w:type="gramEnd"/>
             <w:r>
               <w:t>/events/{</w:t>
             </w:r>
@@ -1502,10 +1528,12 @@
               <w:t>/</w:t>
             </w:r>
             <w:proofErr w:type="spellStart"/>
+            <w:proofErr w:type="gramStart"/>
             <w:r>
               <w:t>api</w:t>
             </w:r>
             <w:proofErr w:type="spellEnd"/>
+            <w:proofErr w:type="gramEnd"/>
             <w:r>
               <w:t>/categories/{id}</w:t>
             </w:r>
@@ -1754,10 +1782,12 @@
               <w:t>/</w:t>
             </w:r>
             <w:proofErr w:type="spellStart"/>
+            <w:proofErr w:type="gramStart"/>
             <w:r>
               <w:t>api</w:t>
             </w:r>
             <w:proofErr w:type="spellEnd"/>
+            <w:proofErr w:type="gramEnd"/>
             <w:r>
               <w:t>/events/{</w:t>
             </w:r>
@@ -1842,10 +1872,12 @@
               <w:t>/</w:t>
             </w:r>
             <w:proofErr w:type="spellStart"/>
+            <w:proofErr w:type="gramStart"/>
             <w:r>
               <w:t>api</w:t>
             </w:r>
             <w:proofErr w:type="spellEnd"/>
+            <w:proofErr w:type="gramEnd"/>
             <w:r>
               <w:t>/</w:t>
             </w:r>
@@ -2105,10 +2137,12 @@
               <w:t>/</w:t>
             </w:r>
             <w:proofErr w:type="spellStart"/>
+            <w:proofErr w:type="gramStart"/>
             <w:r>
               <w:t>api</w:t>
             </w:r>
             <w:proofErr w:type="spellEnd"/>
+            <w:proofErr w:type="gramEnd"/>
             <w:r>
               <w:t>/events/{</w:t>
             </w:r>
@@ -2164,12 +2198,26 @@
         </w:tc>
       </w:tr>
     </w:tbl>
-    <w:p/>
+    <w:p>
+      <w:pPr>
+        <w:rPr>
+          <w:rFonts w:asciiTheme="majorHAnsi" w:eastAsiaTheme="majorEastAsia" w:hAnsiTheme="majorHAnsi" w:cstheme="majorBidi"/>
+          <w:color w:val="0F4761" w:themeColor="accent1" w:themeShade="BF"/>
+          <w:sz w:val="40"/>
+          <w:szCs w:val="40"/>
+        </w:rPr>
+      </w:pPr>
+      <w:r>
+        <w:lastRenderedPageBreak/>
+        <w:br w:type="page"/>
+      </w:r>
+    </w:p>
     <w:p>
       <w:pPr>
         <w:pStyle w:val="Heading1"/>
       </w:pPr>
       <w:r>
+        <w:lastRenderedPageBreak/>
         <w:t>Section C – SQL Database Script</w:t>
       </w:r>
     </w:p>
@@ -2201,8 +2249,13 @@
     </w:p>
     <w:p>
       <w:r>
-        <w:t>create table Users(</w:t>
-      </w:r>
+        <w:t xml:space="preserve">create table </w:t>
+      </w:r>
+      <w:proofErr w:type="gramStart"/>
+      <w:r>
+        <w:t>Users(</w:t>
+      </w:r>
+      <w:proofErr w:type="gramEnd"/>
     </w:p>
     <w:p>
       <w:r>
@@ -2214,7 +2267,15 @@
       </w:r>
       <w:proofErr w:type="spellEnd"/>
       <w:r>
-        <w:t xml:space="preserve"> int identity(1000, 1) primary key,</w:t>
+        <w:t xml:space="preserve"> int </w:t>
+      </w:r>
+      <w:proofErr w:type="gramStart"/>
+      <w:r>
+        <w:t>identity(</w:t>
+      </w:r>
+      <w:proofErr w:type="gramEnd"/>
+      <w:r>
+        <w:t>1000, 1) primary key,</w:t>
       </w:r>
     </w:p>
     <w:p>
@@ -2227,7 +2288,15 @@
       </w:r>
       <w:proofErr w:type="spellEnd"/>
       <w:r>
-        <w:t xml:space="preserve"> varchar(50) not null,</w:t>
+        <w:t xml:space="preserve"> </w:t>
+      </w:r>
+      <w:proofErr w:type="gramStart"/>
+      <w:r>
+        <w:t>varchar(</w:t>
+      </w:r>
+      <w:proofErr w:type="gramEnd"/>
+      <w:r>
+        <w:t>50) not null,</w:t>
       </w:r>
     </w:p>
     <w:p>
@@ -2240,7 +2309,15 @@
       </w:r>
       <w:proofErr w:type="spellEnd"/>
       <w:r>
-        <w:t xml:space="preserve"> varchar(50) not null,</w:t>
+        <w:t xml:space="preserve"> </w:t>
+      </w:r>
+      <w:proofErr w:type="gramStart"/>
+      <w:r>
+        <w:t>varchar(</w:t>
+      </w:r>
+      <w:proofErr w:type="gramEnd"/>
+      <w:r>
+        <w:t>50) not null,</w:t>
       </w:r>
     </w:p>
     <w:p>
@@ -2253,25 +2330,57 @@
       </w:r>
       <w:proofErr w:type="spellEnd"/>
       <w:r>
-        <w:t xml:space="preserve"> varchar(100) not null unique,</w:t>
+        <w:t xml:space="preserve"> </w:t>
+      </w:r>
+      <w:proofErr w:type="gramStart"/>
+      <w:r>
+        <w:t>varchar(</w:t>
+      </w:r>
+      <w:proofErr w:type="gramEnd"/>
+      <w:r>
+        <w:t>100) not null unique,</w:t>
       </w:r>
     </w:p>
     <w:p>
       <w:r>
         <w:tab/>
-        <w:t>password varchar(100) not null,</w:t>
+        <w:t xml:space="preserve">password </w:t>
+      </w:r>
+      <w:proofErr w:type="gramStart"/>
+      <w:r>
+        <w:t>varchar(</w:t>
+      </w:r>
+      <w:proofErr w:type="gramEnd"/>
+      <w:r>
+        <w:t>100) not null,</w:t>
       </w:r>
     </w:p>
     <w:p>
       <w:r>
         <w:tab/>
-        <w:t>username varchar(50) not null unique,</w:t>
+        <w:t xml:space="preserve">username </w:t>
+      </w:r>
+      <w:proofErr w:type="gramStart"/>
+      <w:r>
+        <w:t>varchar(</w:t>
+      </w:r>
+      <w:proofErr w:type="gramEnd"/>
+      <w:r>
+        <w:t>50) not null unique,</w:t>
       </w:r>
     </w:p>
     <w:p>
       <w:r>
         <w:tab/>
-        <w:t>role varchar(50) not null</w:t>
+        <w:t xml:space="preserve">role </w:t>
+      </w:r>
+      <w:proofErr w:type="gramStart"/>
+      <w:r>
+        <w:t>varchar(</w:t>
+      </w:r>
+      <w:proofErr w:type="gramEnd"/>
+      <w:r>
+        <w:t>50) not null</w:t>
       </w:r>
     </w:p>
     <w:p>
@@ -2285,6 +2394,7 @@
         <w:t xml:space="preserve">create table </w:t>
       </w:r>
       <w:proofErr w:type="spellStart"/>
+      <w:proofErr w:type="gramStart"/>
       <w:r>
         <w:t>EventTypes</w:t>
       </w:r>
@@ -2292,6 +2402,7 @@
       <w:r>
         <w:t>(</w:t>
       </w:r>
+      <w:proofErr w:type="gramEnd"/>
     </w:p>
     <w:p>
       <w:r>
@@ -2303,11 +2414,20 @@
       </w:r>
       <w:proofErr w:type="spellEnd"/>
       <w:r>
-        <w:t xml:space="preserve"> int identity(5000, 1) primary key,</w:t>
-      </w:r>
-    </w:p>
-    <w:p>
-      <w:r>
+        <w:t xml:space="preserve"> int </w:t>
+      </w:r>
+      <w:proofErr w:type="gramStart"/>
+      <w:r>
+        <w:t>identity(</w:t>
+      </w:r>
+      <w:proofErr w:type="gramEnd"/>
+      <w:r>
+        <w:t>5000, 1) primary key,</w:t>
+      </w:r>
+    </w:p>
+    <w:p>
+      <w:r>
+        <w:lastRenderedPageBreak/>
         <w:tab/>
       </w:r>
       <w:proofErr w:type="spellStart"/>
@@ -2316,7 +2436,15 @@
       </w:r>
       <w:proofErr w:type="spellEnd"/>
       <w:r>
-        <w:t xml:space="preserve"> varchar(50) not null</w:t>
+        <w:t xml:space="preserve"> </w:t>
+      </w:r>
+      <w:proofErr w:type="gramStart"/>
+      <w:r>
+        <w:t>varchar(</w:t>
+      </w:r>
+      <w:proofErr w:type="gramEnd"/>
+      <w:r>
+        <w:t>50) not null</w:t>
       </w:r>
     </w:p>
     <w:p>
@@ -2327,8 +2455,13 @@
     <w:p/>
     <w:p>
       <w:r>
-        <w:t>create table Events(</w:t>
-      </w:r>
+        <w:t xml:space="preserve">create table </w:t>
+      </w:r>
+      <w:proofErr w:type="gramStart"/>
+      <w:r>
+        <w:t>Events(</w:t>
+      </w:r>
+      <w:proofErr w:type="gramEnd"/>
     </w:p>
     <w:p>
       <w:r>
@@ -2340,7 +2473,15 @@
       </w:r>
       <w:proofErr w:type="spellEnd"/>
       <w:r>
-        <w:t xml:space="preserve"> int identity(2000, 1) primary key,</w:t>
+        <w:t xml:space="preserve"> int </w:t>
+      </w:r>
+      <w:proofErr w:type="gramStart"/>
+      <w:r>
+        <w:t>identity(</w:t>
+      </w:r>
+      <w:proofErr w:type="gramEnd"/>
+      <w:r>
+        <w:t>2000, 1) primary key,</w:t>
       </w:r>
     </w:p>
     <w:p>
@@ -2353,13 +2494,29 @@
       </w:r>
       <w:proofErr w:type="spellEnd"/>
       <w:r>
-        <w:t xml:space="preserve"> varchar(50) not null,</w:t>
+        <w:t xml:space="preserve"> </w:t>
+      </w:r>
+      <w:proofErr w:type="gramStart"/>
+      <w:r>
+        <w:t>varchar(</w:t>
+      </w:r>
+      <w:proofErr w:type="gramEnd"/>
+      <w:r>
+        <w:t>50) not null,</w:t>
       </w:r>
     </w:p>
     <w:p>
       <w:r>
         <w:tab/>
-        <w:t>description varchar(100) not null,</w:t>
+        <w:t xml:space="preserve">description </w:t>
+      </w:r>
+      <w:proofErr w:type="gramStart"/>
+      <w:r>
+        <w:t>varchar(</w:t>
+      </w:r>
+      <w:proofErr w:type="gramEnd"/>
+      <w:r>
+        <w:t>100) not null,</w:t>
       </w:r>
     </w:p>
     <w:p>
@@ -2378,7 +2535,15 @@
     <w:p>
       <w:r>
         <w:tab/>
-        <w:t>location varchar(100) not null,</w:t>
+        <w:t xml:space="preserve">location </w:t>
+      </w:r>
+      <w:proofErr w:type="gramStart"/>
+      <w:r>
+        <w:t>varchar(</w:t>
+      </w:r>
+      <w:proofErr w:type="gramEnd"/>
+      <w:r>
+        <w:t>100) not null,</w:t>
       </w:r>
     </w:p>
     <w:p>
@@ -2467,8 +2632,14 @@
     <w:p/>
     <w:p>
       <w:r>
-        <w:t>create table Categories(</w:t>
-      </w:r>
+        <w:lastRenderedPageBreak/>
+        <w:t xml:space="preserve">create table </w:t>
+      </w:r>
+      <w:proofErr w:type="gramStart"/>
+      <w:r>
+        <w:t>Categories(</w:t>
+      </w:r>
+      <w:proofErr w:type="gramEnd"/>
     </w:p>
     <w:p>
       <w:r>
@@ -2480,7 +2651,15 @@
       </w:r>
       <w:proofErr w:type="spellEnd"/>
       <w:r>
-        <w:t xml:space="preserve"> int identity(6000, 1) primary key,</w:t>
+        <w:t xml:space="preserve"> int </w:t>
+      </w:r>
+      <w:proofErr w:type="gramStart"/>
+      <w:r>
+        <w:t>identity(</w:t>
+      </w:r>
+      <w:proofErr w:type="gramEnd"/>
+      <w:r>
+        <w:t>6000, 1) primary key,</w:t>
       </w:r>
     </w:p>
     <w:p>
@@ -2493,7 +2672,15 @@
       </w:r>
       <w:proofErr w:type="spellEnd"/>
       <w:r>
-        <w:t xml:space="preserve"> varchar(100) not null,</w:t>
+        <w:t xml:space="preserve"> </w:t>
+      </w:r>
+      <w:proofErr w:type="gramStart"/>
+      <w:r>
+        <w:t>varchar(</w:t>
+      </w:r>
+      <w:proofErr w:type="gramEnd"/>
+      <w:r>
+        <w:t>100) not null,</w:t>
       </w:r>
     </w:p>
     <w:p>
@@ -2539,8 +2726,13 @@
     <w:p/>
     <w:p>
       <w:r>
-        <w:t>create table Enrolments(</w:t>
-      </w:r>
+        <w:t xml:space="preserve">create table </w:t>
+      </w:r>
+      <w:proofErr w:type="gramStart"/>
+      <w:r>
+        <w:t>Enrolments(</w:t>
+      </w:r>
+      <w:proofErr w:type="gramEnd"/>
     </w:p>
     <w:p>
       <w:r>
@@ -2552,7 +2744,15 @@
       </w:r>
       <w:proofErr w:type="spellEnd"/>
       <w:r>
-        <w:t xml:space="preserve"> int identity(4000, 1) primary key,</w:t>
+        <w:t xml:space="preserve"> int </w:t>
+      </w:r>
+      <w:proofErr w:type="gramStart"/>
+      <w:r>
+        <w:t>identity(</w:t>
+      </w:r>
+      <w:proofErr w:type="gramEnd"/>
+      <w:r>
+        <w:t>4000, 1) primary key,</w:t>
       </w:r>
     </w:p>
     <w:p>
@@ -2662,6 +2862,7 @@
     </w:p>
     <w:p>
       <w:r>
+        <w:lastRenderedPageBreak/>
         <w:tab/>
       </w:r>
       <w:proofErr w:type="spellStart"/>
@@ -2670,7 +2871,15 @@
       </w:r>
       <w:proofErr w:type="spellEnd"/>
       <w:r>
-        <w:t xml:space="preserve"> varchar(10) not null</w:t>
+        <w:t xml:space="preserve"> </w:t>
+      </w:r>
+      <w:proofErr w:type="gramStart"/>
+      <w:r>
+        <w:t>varchar(</w:t>
+      </w:r>
+      <w:proofErr w:type="gramEnd"/>
+      <w:r>
+        <w:t>10) not null</w:t>
       </w:r>
     </w:p>
     <w:p>
@@ -2682,8 +2891,13 @@
     <w:p/>
     <w:p>
       <w:r>
-        <w:t>create table Results(</w:t>
-      </w:r>
+        <w:t xml:space="preserve">create table </w:t>
+      </w:r>
+      <w:proofErr w:type="gramStart"/>
+      <w:r>
+        <w:t>Results(</w:t>
+      </w:r>
+      <w:proofErr w:type="gramEnd"/>
     </w:p>
     <w:p>
       <w:r>
@@ -2695,7 +2909,15 @@
       </w:r>
       <w:proofErr w:type="spellEnd"/>
       <w:r>
-        <w:t xml:space="preserve"> int identity(1, 1) primary key,</w:t>
+        <w:t xml:space="preserve"> int </w:t>
+      </w:r>
+      <w:proofErr w:type="gramStart"/>
+      <w:r>
+        <w:t>identity(</w:t>
+      </w:r>
+      <w:proofErr w:type="gramEnd"/>
+      <w:r>
+        <w:t>1, 1) primary key,</w:t>
       </w:r>
     </w:p>
     <w:p>
@@ -2774,9 +2996,14 @@
     </w:p>
     <w:p>
       <w:r>
-        <w:t>insert into Users(</w:t>
-      </w:r>
-      <w:proofErr w:type="spellStart"/>
+        <w:t xml:space="preserve">insert into </w:t>
+      </w:r>
+      <w:proofErr w:type="gramStart"/>
+      <w:r>
+        <w:t>Users(</w:t>
+      </w:r>
+      <w:proofErr w:type="spellStart"/>
+      <w:proofErr w:type="gramEnd"/>
       <w:r>
         <w:t>firstName</w:t>
       </w:r>
@@ -2820,20 +3047,45 @@
     </w:p>
     <w:p>
       <w:r>
+        <w:lastRenderedPageBreak/>
         <w:tab/>
-        <w:t>('John','Mokoena','john@gmail.com','HASHED_PASSWORD2','johnm','Organiser'),</w:t>
+        <w:t>('John','Mokoena</w:t>
+      </w:r>
+      <w:proofErr w:type="gramStart"/>
+      <w:r>
+        <w:t>','john@gmail.com</w:t>
+      </w:r>
+      <w:proofErr w:type="gramEnd"/>
+      <w:r>
+        <w:t>','HASHED_PASSWORD2','johnm','Organiser'),</w:t>
       </w:r>
     </w:p>
     <w:p>
       <w:r>
         <w:tab/>
-        <w:t>('Walter','White','walterw@gmail.com','HASHED_PASSWORD3','wwhite','Participant'),</w:t>
+        <w:t>('Walter','White</w:t>
+      </w:r>
+      <w:proofErr w:type="gramStart"/>
+      <w:r>
+        <w:t>','walterw@gmail.com</w:t>
+      </w:r>
+      <w:proofErr w:type="gramEnd"/>
+      <w:r>
+        <w:t>','HASHED_PASSWORD3','wwhite','Participant'),</w:t>
       </w:r>
     </w:p>
     <w:p>
       <w:r>
         <w:tab/>
-        <w:t>('Marty','Byrd','martybyrd@gmail.com','HASHED_PASSWORD4','byrdm','Participant');</w:t>
+        <w:t>('Marty','Byrd</w:t>
+      </w:r>
+      <w:proofErr w:type="gramStart"/>
+      <w:r>
+        <w:t>','martybyrd@gmail.com</w:t>
+      </w:r>
+      <w:proofErr w:type="gramEnd"/>
+      <w:r>
+        <w:t>','HASHED_PASSWORD4','byrdm','Participant');</w:t>
       </w:r>
     </w:p>
     <w:p/>
@@ -2870,9 +3122,14 @@
     <w:p/>
     <w:p>
       <w:r>
-        <w:t>insert into Events(</w:t>
-      </w:r>
-      <w:proofErr w:type="spellStart"/>
+        <w:t xml:space="preserve">insert into </w:t>
+      </w:r>
+      <w:proofErr w:type="gramStart"/>
+      <w:r>
+        <w:t>Events(</w:t>
+      </w:r>
+      <w:proofErr w:type="spellStart"/>
+      <w:proofErr w:type="gramEnd"/>
       <w:r>
         <w:t>eventName</w:t>
       </w:r>
@@ -2947,9 +3204,14 @@
     </w:p>
     <w:p>
       <w:r>
-        <w:t>insert into Categories(</w:t>
-      </w:r>
-      <w:proofErr w:type="spellStart"/>
+        <w:t xml:space="preserve">insert into </w:t>
+      </w:r>
+      <w:proofErr w:type="gramStart"/>
+      <w:r>
+        <w:t>Categories(</w:t>
+      </w:r>
+      <w:proofErr w:type="spellStart"/>
+      <w:proofErr w:type="gramEnd"/>
       <w:r>
         <w:t>categoryName</w:t>
       </w:r>
@@ -2984,9 +3246,14 @@
     <w:p/>
     <w:p>
       <w:r>
-        <w:t>insert into Enrolments(</w:t>
-      </w:r>
-      <w:proofErr w:type="spellStart"/>
+        <w:t xml:space="preserve">insert into </w:t>
+      </w:r>
+      <w:proofErr w:type="gramStart"/>
+      <w:r>
+        <w:t>Enrolments(</w:t>
+      </w:r>
+      <w:proofErr w:type="spellStart"/>
+      <w:proofErr w:type="gramEnd"/>
       <w:r>
         <w:t>participantId</w:t>
       </w:r>
@@ -3046,10 +3313,7 @@
     <w:p/>
     <w:p>
       <w:r>
-        <w:t>Git (2026)</w:t>
-      </w:r>
-      <w:r>
-        <w:t xml:space="preserve"> </w:t>
+        <w:t xml:space="preserve">Git (2026) </w:t>
       </w:r>
       <w:r>
         <w:rPr>
@@ -3059,10 +3323,7 @@
         <w:t>Reference</w:t>
       </w:r>
       <w:r>
-        <w:t>. Available at:</w:t>
-      </w:r>
-      <w:r>
-        <w:t xml:space="preserve"> </w:t>
+        <w:t xml:space="preserve">. Available at: </w:t>
       </w:r>
       <w:hyperlink r:id="rId5" w:history="1">
         <w:r>
@@ -3101,10 +3362,7 @@
         <w:t>Primary and foreign key constraints – SQL Server</w:t>
       </w:r>
       <w:r>
-        <w:t>. Available at:</w:t>
-      </w:r>
-      <w:r>
-        <w:t xml:space="preserve"> </w:t>
+        <w:t xml:space="preserve">. Available at: </w:t>
       </w:r>
       <w:hyperlink r:id="rId6" w:history="1">
         <w:r>
@@ -3143,10 +3401,7 @@
         <w:t>CREATE TABLE (Transact-SQL)</w:t>
       </w:r>
       <w:r>
-        <w:t>. Available at:</w:t>
-      </w:r>
-      <w:r>
-        <w:t xml:space="preserve"> </w:t>
+        <w:t xml:space="preserve">. Available at: </w:t>
       </w:r>
       <w:hyperlink r:id="rId7" w:history="1">
         <w:r>
@@ -3185,10 +3440,7 @@
         <w:t>Authentication and Authorization in ASP.NET Web API</w:t>
       </w:r>
       <w:r>
-        <w:t>. Available at:</w:t>
-      </w:r>
-      <w:r>
-        <w:t xml:space="preserve"> </w:t>
+        <w:t xml:space="preserve">. Available at: </w:t>
       </w:r>
       <w:hyperlink r:id="rId8" w:history="1">
         <w:r>
@@ -3217,6 +3469,7 @@
     </w:p>
     <w:p>
       <w:r>
+        <w:lastRenderedPageBreak/>
         <w:t xml:space="preserve">Postman Blog (2025) </w:t>
       </w:r>
       <w:r>
@@ -3240,7 +3493,15 @@
           <w:i/>
           <w:iCs/>
         </w:rPr>
-        <w:t xml:space="preserve"> endpoint?</w:t>
+        <w:t xml:space="preserve"> </w:t>
+      </w:r>
+      <w:proofErr w:type="gramStart"/>
+      <w:r>
+        <w:rPr>
+          <w:i/>
+          <w:iCs/>
+        </w:rPr>
+        <w:t>endpoint?</w:t>
       </w:r>
       <w:r>
         <w:rPr>
@@ -3249,6 +3510,7 @@
         </w:rPr>
         <w:t>.</w:t>
       </w:r>
+      <w:proofErr w:type="gramEnd"/>
       <w:r>
         <w:t xml:space="preserve"> Available at: </w:t>
       </w:r>
@@ -3877,6 +4139,7 @@
   <w:style w:type="character" w:default="1" w:styleId="DefaultParagraphFont">
     <w:name w:val="Default Paragraph Font"/>
     <w:uiPriority w:val="1"/>
+    <w:semiHidden/>
     <w:unhideWhenUsed/>
   </w:style>
   <w:style w:type="table" w:default="1" w:styleId="TableNormal">

</xml_diff>

<commit_message>
Added Results endpoints and model
</commit_message>
<xml_diff>
--- a/Documents/Race Day Plan.docx
+++ b/Documents/Race Day Plan.docx
@@ -12,7 +12,6 @@
         <w:pStyle w:val="Heading1"/>
       </w:pPr>
       <w:r>
-        <w:lastRenderedPageBreak/>
         <w:t xml:space="preserve">Section A </w:t>
       </w:r>
       <w:r>
@@ -24,7 +23,6 @@
         <w:rPr>
           <w:noProof/>
         </w:rPr>
-        <w:lastRenderedPageBreak/>
         <w:drawing>
           <wp:inline distT="0" distB="0" distL="0" distR="0" wp14:anchorId="0D4E9E7B" wp14:editId="0E248774">
             <wp:extent cx="9229060" cy="6097905"/>
@@ -402,15 +400,7 @@
           </w:tcPr>
           <w:p>
             <w:r>
-              <w:t xml:space="preserve">View logged in </w:t>
-            </w:r>
-            <w:proofErr w:type="gramStart"/>
-            <w:r>
-              <w:t>users</w:t>
-            </w:r>
-            <w:proofErr w:type="gramEnd"/>
-            <w:r>
-              <w:t xml:space="preserve"> profile</w:t>
+              <w:t>View logged in users profile</w:t>
             </w:r>
           </w:p>
         </w:tc>
@@ -490,15 +480,7 @@
           </w:tcPr>
           <w:p>
             <w:r>
-              <w:t xml:space="preserve">Update logged in </w:t>
-            </w:r>
-            <w:proofErr w:type="gramStart"/>
-            <w:r>
-              <w:t>users</w:t>
-            </w:r>
-            <w:proofErr w:type="gramEnd"/>
-            <w:r>
-              <w:t xml:space="preserve"> profile</w:t>
+              <w:t>Update logged in users profile</w:t>
             </w:r>
           </w:p>
         </w:tc>
@@ -968,7 +950,6 @@
           </w:tcPr>
           <w:p>
             <w:r>
-              <w:lastRenderedPageBreak/>
               <w:t>Event Types</w:t>
             </w:r>
           </w:p>
@@ -1254,12 +1235,10 @@
               <w:t>/</w:t>
             </w:r>
             <w:proofErr w:type="spellStart"/>
-            <w:proofErr w:type="gramStart"/>
             <w:r>
               <w:t>api</w:t>
             </w:r>
             <w:proofErr w:type="spellEnd"/>
-            <w:proofErr w:type="gramEnd"/>
             <w:r>
               <w:t>/events/{</w:t>
             </w:r>
@@ -1346,12 +1325,10 @@
               <w:t>/</w:t>
             </w:r>
             <w:proofErr w:type="spellStart"/>
-            <w:proofErr w:type="gramStart"/>
             <w:r>
               <w:t>api</w:t>
             </w:r>
             <w:proofErr w:type="spellEnd"/>
-            <w:proofErr w:type="gramEnd"/>
             <w:r>
               <w:t>/events/{</w:t>
             </w:r>
@@ -1436,12 +1413,10 @@
               <w:t>/</w:t>
             </w:r>
             <w:proofErr w:type="spellStart"/>
-            <w:proofErr w:type="gramStart"/>
             <w:r>
               <w:t>api</w:t>
             </w:r>
             <w:proofErr w:type="spellEnd"/>
-            <w:proofErr w:type="gramEnd"/>
             <w:r>
               <w:t>/events/{</w:t>
             </w:r>
@@ -1528,12 +1503,10 @@
               <w:t>/</w:t>
             </w:r>
             <w:proofErr w:type="spellStart"/>
-            <w:proofErr w:type="gramStart"/>
             <w:r>
               <w:t>api</w:t>
             </w:r>
             <w:proofErr w:type="spellEnd"/>
-            <w:proofErr w:type="gramEnd"/>
             <w:r>
               <w:t>/categories/{id}</w:t>
             </w:r>
@@ -1627,7 +1600,11 @@
           </w:tcPr>
           <w:p>
             <w:r>
-              <w:t>Enter an event and choose a category</w:t>
+              <w:t xml:space="preserve">Enter an event and </w:t>
+            </w:r>
+            <w:r>
+              <w:lastRenderedPageBreak/>
+              <w:t>choose a category</w:t>
             </w:r>
           </w:p>
         </w:tc>
@@ -1637,6 +1614,7 @@
           </w:tcPr>
           <w:p>
             <w:r>
+              <w:lastRenderedPageBreak/>
               <w:t>Participant</w:t>
             </w:r>
           </w:p>
@@ -1707,7 +1685,7 @@
             </w:r>
             <w:proofErr w:type="spellEnd"/>
             <w:r>
-              <w:t>/enrolments/my</w:t>
+              <w:t>/enrolments/</w:t>
             </w:r>
           </w:p>
         </w:tc>
@@ -1782,12 +1760,10 @@
               <w:t>/</w:t>
             </w:r>
             <w:proofErr w:type="spellStart"/>
-            <w:proofErr w:type="gramStart"/>
             <w:r>
               <w:t>api</w:t>
             </w:r>
             <w:proofErr w:type="spellEnd"/>
-            <w:proofErr w:type="gramEnd"/>
             <w:r>
               <w:t>/events/{</w:t>
             </w:r>
@@ -1872,12 +1848,10 @@
               <w:t>/</w:t>
             </w:r>
             <w:proofErr w:type="spellStart"/>
-            <w:proofErr w:type="gramStart"/>
             <w:r>
               <w:t>api</w:t>
             </w:r>
             <w:proofErr w:type="spellEnd"/>
-            <w:proofErr w:type="gramEnd"/>
             <w:r>
               <w:t>/</w:t>
             </w:r>
@@ -2137,12 +2111,10 @@
               <w:t>/</w:t>
             </w:r>
             <w:proofErr w:type="spellStart"/>
-            <w:proofErr w:type="gramStart"/>
             <w:r>
               <w:t>api</w:t>
             </w:r>
             <w:proofErr w:type="spellEnd"/>
-            <w:proofErr w:type="gramEnd"/>
             <w:r>
               <w:t>/events/{</w:t>
             </w:r>
@@ -2208,7 +2180,6 @@
         </w:rPr>
       </w:pPr>
       <w:r>
-        <w:lastRenderedPageBreak/>
         <w:br w:type="page"/>
       </w:r>
     </w:p>
@@ -2249,17 +2220,211 @@
     </w:p>
     <w:p>
       <w:r>
+        <w:t>create table Users(</w:t>
+      </w:r>
+    </w:p>
+    <w:p>
+      <w:r>
+        <w:tab/>
+      </w:r>
+      <w:proofErr w:type="spellStart"/>
+      <w:r>
+        <w:t>userId</w:t>
+      </w:r>
+      <w:proofErr w:type="spellEnd"/>
+      <w:r>
+        <w:t xml:space="preserve"> int identity(1000, 1) primary key,</w:t>
+      </w:r>
+    </w:p>
+    <w:p>
+      <w:r>
+        <w:tab/>
+      </w:r>
+      <w:proofErr w:type="spellStart"/>
+      <w:r>
+        <w:t>firstName</w:t>
+      </w:r>
+      <w:proofErr w:type="spellEnd"/>
+      <w:r>
+        <w:t xml:space="preserve"> varchar(50) not null,</w:t>
+      </w:r>
+    </w:p>
+    <w:p>
+      <w:r>
+        <w:tab/>
+      </w:r>
+      <w:proofErr w:type="spellStart"/>
+      <w:r>
+        <w:t>lastName</w:t>
+      </w:r>
+      <w:proofErr w:type="spellEnd"/>
+      <w:r>
+        <w:t xml:space="preserve"> varchar(50) not null,</w:t>
+      </w:r>
+    </w:p>
+    <w:p>
+      <w:r>
+        <w:tab/>
+      </w:r>
+      <w:proofErr w:type="spellStart"/>
+      <w:r>
+        <w:t>emailAddress</w:t>
+      </w:r>
+      <w:proofErr w:type="spellEnd"/>
+      <w:r>
+        <w:t xml:space="preserve"> varchar(100) not null unique,</w:t>
+      </w:r>
+    </w:p>
+    <w:p>
+      <w:r>
+        <w:tab/>
+        <w:t>password varchar(100) not null,</w:t>
+      </w:r>
+    </w:p>
+    <w:p>
+      <w:r>
+        <w:tab/>
+        <w:t>username varchar(50) not null unique,</w:t>
+      </w:r>
+    </w:p>
+    <w:p>
+      <w:r>
+        <w:tab/>
+        <w:t>role varchar(50) not null</w:t>
+      </w:r>
+    </w:p>
+    <w:p>
+      <w:r>
+        <w:t>);</w:t>
+      </w:r>
+    </w:p>
+    <w:p/>
+    <w:p>
+      <w:r>
         <w:t xml:space="preserve">create table </w:t>
       </w:r>
-      <w:proofErr w:type="gramStart"/>
-      <w:r>
-        <w:t>Users(</w:t>
-      </w:r>
-      <w:proofErr w:type="gramEnd"/>
-    </w:p>
-    <w:p>
-      <w:r>
-        <w:tab/>
+      <w:proofErr w:type="spellStart"/>
+      <w:r>
+        <w:t>EventTypes</w:t>
+      </w:r>
+      <w:proofErr w:type="spellEnd"/>
+      <w:r>
+        <w:t>(</w:t>
+      </w:r>
+    </w:p>
+    <w:p>
+      <w:r>
+        <w:tab/>
+      </w:r>
+      <w:proofErr w:type="spellStart"/>
+      <w:r>
+        <w:t>eventTypeId</w:t>
+      </w:r>
+      <w:proofErr w:type="spellEnd"/>
+      <w:r>
+        <w:t xml:space="preserve"> int identity(5000, 1) primary key,</w:t>
+      </w:r>
+    </w:p>
+    <w:p>
+      <w:r>
+        <w:tab/>
+      </w:r>
+      <w:proofErr w:type="spellStart"/>
+      <w:r>
+        <w:t>eventTypeName</w:t>
+      </w:r>
+      <w:proofErr w:type="spellEnd"/>
+      <w:r>
+        <w:t xml:space="preserve"> varchar(50) not null</w:t>
+      </w:r>
+    </w:p>
+    <w:p>
+      <w:r>
+        <w:t>);</w:t>
+      </w:r>
+    </w:p>
+    <w:p/>
+    <w:p>
+      <w:r>
+        <w:t>create table Events(</w:t>
+      </w:r>
+    </w:p>
+    <w:p>
+      <w:r>
+        <w:tab/>
+      </w:r>
+      <w:proofErr w:type="spellStart"/>
+      <w:r>
+        <w:t>eventId</w:t>
+      </w:r>
+      <w:proofErr w:type="spellEnd"/>
+      <w:r>
+        <w:t xml:space="preserve"> int identity(2000, 1) primary key,</w:t>
+      </w:r>
+    </w:p>
+    <w:p>
+      <w:r>
+        <w:tab/>
+      </w:r>
+      <w:proofErr w:type="spellStart"/>
+      <w:r>
+        <w:t>eventName</w:t>
+      </w:r>
+      <w:proofErr w:type="spellEnd"/>
+      <w:r>
+        <w:t xml:space="preserve"> varchar(50) not null,</w:t>
+      </w:r>
+    </w:p>
+    <w:p>
+      <w:r>
+        <w:tab/>
+        <w:t>description varchar(100) not null,</w:t>
+      </w:r>
+    </w:p>
+    <w:p>
+      <w:r>
+        <w:tab/>
+      </w:r>
+      <w:proofErr w:type="spellStart"/>
+      <w:r>
+        <w:t>eventDate</w:t>
+      </w:r>
+      <w:proofErr w:type="spellEnd"/>
+      <w:r>
+        <w:t xml:space="preserve"> date not null,</w:t>
+      </w:r>
+    </w:p>
+    <w:p>
+      <w:r>
+        <w:tab/>
+        <w:t>location varchar(100) not null,</w:t>
+      </w:r>
+    </w:p>
+    <w:p>
+      <w:r>
+        <w:tab/>
+      </w:r>
+      <w:proofErr w:type="spellStart"/>
+      <w:r>
+        <w:t>organiserId</w:t>
+      </w:r>
+      <w:proofErr w:type="spellEnd"/>
+      <w:r>
+        <w:t xml:space="preserve"> int not null,</w:t>
+      </w:r>
+    </w:p>
+    <w:p>
+      <w:r>
+        <w:tab/>
+        <w:t>foreign key(</w:t>
+      </w:r>
+      <w:proofErr w:type="spellStart"/>
+      <w:r>
+        <w:t>organiserId</w:t>
+      </w:r>
+      <w:proofErr w:type="spellEnd"/>
+      <w:r>
+        <w:t>) references Users(</w:t>
       </w:r>
       <w:proofErr w:type="spellStart"/>
       <w:r>
@@ -2267,184 +2432,123 @@
       </w:r>
       <w:proofErr w:type="spellEnd"/>
       <w:r>
-        <w:t xml:space="preserve"> int </w:t>
-      </w:r>
-      <w:proofErr w:type="gramStart"/>
-      <w:r>
-        <w:t>identity(</w:t>
-      </w:r>
-      <w:proofErr w:type="gramEnd"/>
-      <w:r>
-        <w:t>1000, 1) primary key,</w:t>
-      </w:r>
-    </w:p>
-    <w:p>
-      <w:r>
-        <w:tab/>
-      </w:r>
-      <w:proofErr w:type="spellStart"/>
-      <w:r>
-        <w:t>firstName</w:t>
-      </w:r>
-      <w:proofErr w:type="spellEnd"/>
-      <w:r>
-        <w:t xml:space="preserve"> </w:t>
-      </w:r>
-      <w:proofErr w:type="gramStart"/>
-      <w:r>
-        <w:t>varchar(</w:t>
-      </w:r>
-      <w:proofErr w:type="gramEnd"/>
-      <w:r>
-        <w:t>50) not null,</w:t>
-      </w:r>
-    </w:p>
-    <w:p>
-      <w:r>
-        <w:tab/>
-      </w:r>
-      <w:proofErr w:type="spellStart"/>
-      <w:r>
-        <w:t>lastName</w:t>
-      </w:r>
-      <w:proofErr w:type="spellEnd"/>
-      <w:r>
-        <w:t xml:space="preserve"> </w:t>
-      </w:r>
-      <w:proofErr w:type="gramStart"/>
-      <w:r>
-        <w:t>varchar(</w:t>
-      </w:r>
-      <w:proofErr w:type="gramEnd"/>
-      <w:r>
-        <w:t>50) not null,</w:t>
-      </w:r>
-    </w:p>
-    <w:p>
-      <w:r>
-        <w:tab/>
-      </w:r>
-      <w:proofErr w:type="spellStart"/>
-      <w:r>
-        <w:t>emailAddress</w:t>
-      </w:r>
-      <w:proofErr w:type="spellEnd"/>
-      <w:r>
-        <w:t xml:space="preserve"> </w:t>
-      </w:r>
-      <w:proofErr w:type="gramStart"/>
-      <w:r>
-        <w:t>varchar(</w:t>
-      </w:r>
-      <w:proofErr w:type="gramEnd"/>
-      <w:r>
-        <w:t>100) not null unique,</w:t>
-      </w:r>
-    </w:p>
-    <w:p>
-      <w:r>
-        <w:tab/>
-        <w:t xml:space="preserve">password </w:t>
-      </w:r>
-      <w:proofErr w:type="gramStart"/>
-      <w:r>
-        <w:t>varchar(</w:t>
-      </w:r>
-      <w:proofErr w:type="gramEnd"/>
-      <w:r>
-        <w:t>100) not null,</w:t>
-      </w:r>
-    </w:p>
-    <w:p>
-      <w:r>
-        <w:tab/>
-        <w:t xml:space="preserve">username </w:t>
-      </w:r>
-      <w:proofErr w:type="gramStart"/>
-      <w:r>
-        <w:t>varchar(</w:t>
-      </w:r>
-      <w:proofErr w:type="gramEnd"/>
-      <w:r>
-        <w:t>50) not null unique,</w:t>
-      </w:r>
-    </w:p>
-    <w:p>
-      <w:r>
-        <w:tab/>
-        <w:t xml:space="preserve">role </w:t>
-      </w:r>
-      <w:proofErr w:type="gramStart"/>
-      <w:r>
-        <w:t>varchar(</w:t>
-      </w:r>
-      <w:proofErr w:type="gramEnd"/>
-      <w:r>
-        <w:t>50) not null</w:t>
-      </w:r>
-    </w:p>
-    <w:p>
-      <w:r>
+        <w:t>),</w:t>
+      </w:r>
+    </w:p>
+    <w:p>
+      <w:r>
+        <w:tab/>
+      </w:r>
+      <w:proofErr w:type="spellStart"/>
+      <w:r>
+        <w:t>eventTypeId</w:t>
+      </w:r>
+      <w:proofErr w:type="spellEnd"/>
+      <w:r>
+        <w:t xml:space="preserve"> int not null,</w:t>
+      </w:r>
+    </w:p>
+    <w:p>
+      <w:r>
+        <w:tab/>
+        <w:t>foreign key(</w:t>
+      </w:r>
+      <w:proofErr w:type="spellStart"/>
+      <w:r>
+        <w:t>eventTypeId</w:t>
+      </w:r>
+      <w:proofErr w:type="spellEnd"/>
+      <w:r>
+        <w:t xml:space="preserve">) references </w:t>
+      </w:r>
+      <w:proofErr w:type="spellStart"/>
+      <w:r>
+        <w:t>EventTypes</w:t>
+      </w:r>
+      <w:proofErr w:type="spellEnd"/>
+      <w:r>
+        <w:t>(</w:t>
+      </w:r>
+      <w:proofErr w:type="spellStart"/>
+      <w:r>
+        <w:t>eventTypeId</w:t>
+      </w:r>
+      <w:proofErr w:type="spellEnd"/>
+      <w:r>
+        <w:t>)</w:t>
+      </w:r>
+    </w:p>
+    <w:p>
+      <w:r>
+        <w:lastRenderedPageBreak/>
         <w:t>);</w:t>
       </w:r>
     </w:p>
     <w:p/>
     <w:p>
       <w:r>
-        <w:t xml:space="preserve">create table </w:t>
-      </w:r>
-      <w:proofErr w:type="spellStart"/>
-      <w:proofErr w:type="gramStart"/>
-      <w:r>
-        <w:t>EventTypes</w:t>
-      </w:r>
-      <w:proofErr w:type="spellEnd"/>
-      <w:r>
-        <w:t>(</w:t>
-      </w:r>
-      <w:proofErr w:type="gramEnd"/>
-    </w:p>
-    <w:p>
-      <w:r>
-        <w:tab/>
-      </w:r>
-      <w:proofErr w:type="spellStart"/>
-      <w:r>
-        <w:t>eventTypeId</w:t>
-      </w:r>
-      <w:proofErr w:type="spellEnd"/>
-      <w:r>
-        <w:t xml:space="preserve"> int </w:t>
-      </w:r>
-      <w:proofErr w:type="gramStart"/>
-      <w:r>
-        <w:t>identity(</w:t>
-      </w:r>
-      <w:proofErr w:type="gramEnd"/>
-      <w:r>
-        <w:t>5000, 1) primary key,</w:t>
-      </w:r>
-    </w:p>
-    <w:p>
-      <w:r>
-        <w:lastRenderedPageBreak/>
-        <w:tab/>
-      </w:r>
-      <w:proofErr w:type="spellStart"/>
-      <w:r>
-        <w:t>eventTypeName</w:t>
-      </w:r>
-      <w:proofErr w:type="spellEnd"/>
-      <w:r>
-        <w:t xml:space="preserve"> </w:t>
-      </w:r>
-      <w:proofErr w:type="gramStart"/>
-      <w:r>
-        <w:t>varchar(</w:t>
-      </w:r>
-      <w:proofErr w:type="gramEnd"/>
-      <w:r>
-        <w:t>50) not null</w:t>
+        <w:t>create table Categories(</w:t>
+      </w:r>
+    </w:p>
+    <w:p>
+      <w:r>
+        <w:tab/>
+      </w:r>
+      <w:proofErr w:type="spellStart"/>
+      <w:r>
+        <w:t>categoryId</w:t>
+      </w:r>
+      <w:proofErr w:type="spellEnd"/>
+      <w:r>
+        <w:t xml:space="preserve"> int identity(6000, 1) primary key,</w:t>
+      </w:r>
+    </w:p>
+    <w:p>
+      <w:r>
+        <w:tab/>
+      </w:r>
+      <w:proofErr w:type="spellStart"/>
+      <w:r>
+        <w:t>categoryName</w:t>
+      </w:r>
+      <w:proofErr w:type="spellEnd"/>
+      <w:r>
+        <w:t xml:space="preserve"> varchar(100) not null,</w:t>
+      </w:r>
+    </w:p>
+    <w:p>
+      <w:r>
+        <w:tab/>
+      </w:r>
+      <w:proofErr w:type="spellStart"/>
+      <w:r>
+        <w:t>eventId</w:t>
+      </w:r>
+      <w:proofErr w:type="spellEnd"/>
+      <w:r>
+        <w:t xml:space="preserve"> int not null,</w:t>
+      </w:r>
+    </w:p>
+    <w:p>
+      <w:r>
+        <w:tab/>
+        <w:t>foreign key(</w:t>
+      </w:r>
+      <w:proofErr w:type="spellStart"/>
+      <w:r>
+        <w:t>eventId</w:t>
+      </w:r>
+      <w:proofErr w:type="spellEnd"/>
+      <w:r>
+        <w:t>) references Events(</w:t>
+      </w:r>
+      <w:proofErr w:type="spellStart"/>
+      <w:r>
+        <w:t>eventId</w:t>
+      </w:r>
+      <w:proofErr w:type="spellEnd"/>
+      <w:r>
+        <w:t>)</w:t>
       </w:r>
     </w:p>
     <w:p>
@@ -2455,13 +2559,56 @@
     <w:p/>
     <w:p>
       <w:r>
-        <w:t xml:space="preserve">create table </w:t>
-      </w:r>
-      <w:proofErr w:type="gramStart"/>
-      <w:r>
-        <w:t>Events(</w:t>
-      </w:r>
-      <w:proofErr w:type="gramEnd"/>
+        <w:t>create table Enrolments(</w:t>
+      </w:r>
+    </w:p>
+    <w:p>
+      <w:r>
+        <w:tab/>
+      </w:r>
+      <w:proofErr w:type="spellStart"/>
+      <w:r>
+        <w:t>enrolmentId</w:t>
+      </w:r>
+      <w:proofErr w:type="spellEnd"/>
+      <w:r>
+        <w:t xml:space="preserve"> int identity(4000, 1) primary key,</w:t>
+      </w:r>
+    </w:p>
+    <w:p>
+      <w:r>
+        <w:tab/>
+      </w:r>
+      <w:proofErr w:type="spellStart"/>
+      <w:r>
+        <w:t>participantId</w:t>
+      </w:r>
+      <w:proofErr w:type="spellEnd"/>
+      <w:r>
+        <w:t xml:space="preserve"> int not null,</w:t>
+      </w:r>
+    </w:p>
+    <w:p>
+      <w:r>
+        <w:tab/>
+        <w:t>foreign key(</w:t>
+      </w:r>
+      <w:proofErr w:type="spellStart"/>
+      <w:r>
+        <w:t>participantId</w:t>
+      </w:r>
+      <w:proofErr w:type="spellEnd"/>
+      <w:r>
+        <w:t>) references Users(</w:t>
+      </w:r>
+      <w:proofErr w:type="spellStart"/>
+      <w:r>
+        <w:t>userId</w:t>
+      </w:r>
+      <w:proofErr w:type="spellEnd"/>
+      <w:r>
+        <w:t>),</w:t>
+      </w:r>
     </w:p>
     <w:p>
       <w:r>
@@ -2473,90 +2620,7 @@
       </w:r>
       <w:proofErr w:type="spellEnd"/>
       <w:r>
-        <w:t xml:space="preserve"> int </w:t>
-      </w:r>
-      <w:proofErr w:type="gramStart"/>
-      <w:r>
-        <w:t>identity(</w:t>
-      </w:r>
-      <w:proofErr w:type="gramEnd"/>
-      <w:r>
-        <w:t>2000, 1) primary key,</w:t>
-      </w:r>
-    </w:p>
-    <w:p>
-      <w:r>
-        <w:tab/>
-      </w:r>
-      <w:proofErr w:type="spellStart"/>
-      <w:r>
-        <w:t>eventName</w:t>
-      </w:r>
-      <w:proofErr w:type="spellEnd"/>
-      <w:r>
-        <w:t xml:space="preserve"> </w:t>
-      </w:r>
-      <w:proofErr w:type="gramStart"/>
-      <w:r>
-        <w:t>varchar(</w:t>
-      </w:r>
-      <w:proofErr w:type="gramEnd"/>
-      <w:r>
-        <w:t>50) not null,</w:t>
-      </w:r>
-    </w:p>
-    <w:p>
-      <w:r>
-        <w:tab/>
-        <w:t xml:space="preserve">description </w:t>
-      </w:r>
-      <w:proofErr w:type="gramStart"/>
-      <w:r>
-        <w:t>varchar(</w:t>
-      </w:r>
-      <w:proofErr w:type="gramEnd"/>
-      <w:r>
-        <w:t>100) not null,</w:t>
-      </w:r>
-    </w:p>
-    <w:p>
-      <w:r>
-        <w:tab/>
-      </w:r>
-      <w:proofErr w:type="spellStart"/>
-      <w:r>
-        <w:t>eventDate</w:t>
-      </w:r>
-      <w:proofErr w:type="spellEnd"/>
-      <w:r>
-        <w:t xml:space="preserve"> date not null,</w:t>
-      </w:r>
-    </w:p>
-    <w:p>
-      <w:r>
-        <w:tab/>
-        <w:t xml:space="preserve">location </w:t>
-      </w:r>
-      <w:proofErr w:type="gramStart"/>
-      <w:r>
-        <w:t>varchar(</w:t>
-      </w:r>
-      <w:proofErr w:type="gramEnd"/>
-      <w:r>
-        <w:t>100) not null,</w:t>
-      </w:r>
-    </w:p>
-    <w:p>
-      <w:r>
-        <w:tab/>
-      </w:r>
-      <w:proofErr w:type="spellStart"/>
-      <w:r>
-        <w:t>organiserId</w:t>
-      </w:r>
-      <w:proofErr w:type="spellEnd"/>
-      <w:r>
-        <w:t xml:space="preserve"> int not null,</w:t>
+        <w:t xml:space="preserve"> int,</w:t>
       </w:r>
     </w:p>
     <w:p>
@@ -2566,15 +2630,15 @@
       </w:r>
       <w:proofErr w:type="spellStart"/>
       <w:r>
-        <w:t>organiserId</w:t>
-      </w:r>
-      <w:proofErr w:type="spellEnd"/>
-      <w:r>
-        <w:t>) references Users(</w:t>
-      </w:r>
-      <w:proofErr w:type="spellStart"/>
-      <w:r>
-        <w:t>userId</w:t>
+        <w:t>eventId</w:t>
+      </w:r>
+      <w:proofErr w:type="spellEnd"/>
+      <w:r>
+        <w:t>) references Events(</w:t>
+      </w:r>
+      <w:proofErr w:type="spellStart"/>
+      <w:r>
+        <w:t>eventId</w:t>
       </w:r>
       <w:proofErr w:type="spellEnd"/>
       <w:r>
@@ -2587,11 +2651,11 @@
       </w:r>
       <w:proofErr w:type="spellStart"/>
       <w:r>
-        <w:t>eventTypeId</w:t>
-      </w:r>
-      <w:proofErr w:type="spellEnd"/>
-      <w:r>
-        <w:t xml:space="preserve"> int not null,</w:t>
+        <w:t>categoryId</w:t>
+      </w:r>
+      <w:proofErr w:type="spellEnd"/>
+      <w:r>
+        <w:t xml:space="preserve"> int,</w:t>
       </w:r>
     </w:p>
     <w:p>
@@ -2601,189 +2665,15 @@
       </w:r>
       <w:proofErr w:type="spellStart"/>
       <w:r>
-        <w:t>eventTypeId</w:t>
-      </w:r>
-      <w:proofErr w:type="spellEnd"/>
-      <w:r>
-        <w:t xml:space="preserve">) references </w:t>
-      </w:r>
-      <w:proofErr w:type="spellStart"/>
-      <w:r>
-        <w:t>EventTypes</w:t>
-      </w:r>
-      <w:proofErr w:type="spellEnd"/>
-      <w:r>
-        <w:t>(</w:t>
-      </w:r>
-      <w:proofErr w:type="spellStart"/>
-      <w:r>
-        <w:t>eventTypeId</w:t>
-      </w:r>
-      <w:proofErr w:type="spellEnd"/>
-      <w:r>
-        <w:t>)</w:t>
-      </w:r>
-    </w:p>
-    <w:p>
-      <w:r>
-        <w:t>);</w:t>
-      </w:r>
-    </w:p>
-    <w:p/>
-    <w:p>
-      <w:r>
-        <w:lastRenderedPageBreak/>
-        <w:t xml:space="preserve">create table </w:t>
-      </w:r>
-      <w:proofErr w:type="gramStart"/>
-      <w:r>
-        <w:t>Categories(</w:t>
-      </w:r>
-      <w:proofErr w:type="gramEnd"/>
-    </w:p>
-    <w:p>
-      <w:r>
-        <w:tab/>
-      </w:r>
-      <w:proofErr w:type="spellStart"/>
-      <w:r>
         <w:t>categoryId</w:t>
       </w:r>
       <w:proofErr w:type="spellEnd"/>
       <w:r>
-        <w:t xml:space="preserve"> int </w:t>
-      </w:r>
-      <w:proofErr w:type="gramStart"/>
-      <w:r>
-        <w:t>identity(</w:t>
-      </w:r>
-      <w:proofErr w:type="gramEnd"/>
-      <w:r>
-        <w:t>6000, 1) primary key,</w:t>
-      </w:r>
-    </w:p>
-    <w:p>
-      <w:r>
-        <w:tab/>
-      </w:r>
-      <w:proofErr w:type="spellStart"/>
-      <w:r>
-        <w:t>categoryName</w:t>
-      </w:r>
-      <w:proofErr w:type="spellEnd"/>
-      <w:r>
-        <w:t xml:space="preserve"> </w:t>
-      </w:r>
-      <w:proofErr w:type="gramStart"/>
-      <w:r>
-        <w:t>varchar(</w:t>
-      </w:r>
-      <w:proofErr w:type="gramEnd"/>
-      <w:r>
-        <w:t>100) not null,</w:t>
-      </w:r>
-    </w:p>
-    <w:p>
-      <w:r>
-        <w:tab/>
-      </w:r>
-      <w:proofErr w:type="spellStart"/>
-      <w:r>
-        <w:t>eventId</w:t>
-      </w:r>
-      <w:proofErr w:type="spellEnd"/>
-      <w:r>
-        <w:t xml:space="preserve"> int not null,</w:t>
-      </w:r>
-    </w:p>
-    <w:p>
-      <w:r>
-        <w:tab/>
-        <w:t>foreign key(</w:t>
-      </w:r>
-      <w:proofErr w:type="spellStart"/>
-      <w:r>
-        <w:t>eventId</w:t>
-      </w:r>
-      <w:proofErr w:type="spellEnd"/>
-      <w:r>
-        <w:t>) references Events(</w:t>
-      </w:r>
-      <w:proofErr w:type="spellStart"/>
-      <w:r>
-        <w:t>eventId</w:t>
-      </w:r>
-      <w:proofErr w:type="spellEnd"/>
-      <w:r>
-        <w:t>)</w:t>
-      </w:r>
-    </w:p>
-    <w:p>
-      <w:r>
-        <w:t>);</w:t>
-      </w:r>
-    </w:p>
-    <w:p/>
-    <w:p>
-      <w:r>
-        <w:t xml:space="preserve">create table </w:t>
-      </w:r>
-      <w:proofErr w:type="gramStart"/>
-      <w:r>
-        <w:t>Enrolments(</w:t>
-      </w:r>
-      <w:proofErr w:type="gramEnd"/>
-    </w:p>
-    <w:p>
-      <w:r>
-        <w:tab/>
-      </w:r>
-      <w:proofErr w:type="spellStart"/>
-      <w:r>
-        <w:t>enrolmentId</w:t>
-      </w:r>
-      <w:proofErr w:type="spellEnd"/>
-      <w:r>
-        <w:t xml:space="preserve"> int </w:t>
-      </w:r>
-      <w:proofErr w:type="gramStart"/>
-      <w:r>
-        <w:t>identity(</w:t>
-      </w:r>
-      <w:proofErr w:type="gramEnd"/>
-      <w:r>
-        <w:t>4000, 1) primary key,</w:t>
-      </w:r>
-    </w:p>
-    <w:p>
-      <w:r>
-        <w:tab/>
-      </w:r>
-      <w:proofErr w:type="spellStart"/>
-      <w:r>
-        <w:t>participantId</w:t>
-      </w:r>
-      <w:proofErr w:type="spellEnd"/>
-      <w:r>
-        <w:t xml:space="preserve"> int not null,</w:t>
-      </w:r>
-    </w:p>
-    <w:p>
-      <w:r>
-        <w:tab/>
-        <w:t>foreign key(</w:t>
-      </w:r>
-      <w:proofErr w:type="spellStart"/>
-      <w:r>
-        <w:t>participantId</w:t>
-      </w:r>
-      <w:proofErr w:type="spellEnd"/>
-      <w:r>
-        <w:t>) references Users(</w:t>
-      </w:r>
-      <w:proofErr w:type="spellStart"/>
-      <w:r>
-        <w:t>userId</w:t>
+        <w:t>) references Categories(</w:t>
+      </w:r>
+      <w:proofErr w:type="spellStart"/>
+      <w:r>
+        <w:t>categoryId</w:t>
       </w:r>
       <w:proofErr w:type="spellEnd"/>
       <w:r>
@@ -2796,90 +2686,11 @@
       </w:r>
       <w:proofErr w:type="spellStart"/>
       <w:r>
-        <w:t>eventId</w:t>
-      </w:r>
-      <w:proofErr w:type="spellEnd"/>
-      <w:r>
-        <w:t xml:space="preserve"> int,</w:t>
-      </w:r>
-    </w:p>
-    <w:p>
-      <w:r>
-        <w:tab/>
-        <w:t>foreign key(</w:t>
-      </w:r>
-      <w:proofErr w:type="spellStart"/>
-      <w:r>
-        <w:t>eventId</w:t>
-      </w:r>
-      <w:proofErr w:type="spellEnd"/>
-      <w:r>
-        <w:t>) references Events(</w:t>
-      </w:r>
-      <w:proofErr w:type="spellStart"/>
-      <w:r>
-        <w:t>eventId</w:t>
-      </w:r>
-      <w:proofErr w:type="spellEnd"/>
-      <w:r>
-        <w:t>),</w:t>
-      </w:r>
-    </w:p>
-    <w:p>
-      <w:r>
-        <w:tab/>
-      </w:r>
-      <w:proofErr w:type="spellStart"/>
-      <w:r>
-        <w:t>categoryId</w:t>
-      </w:r>
-      <w:proofErr w:type="spellEnd"/>
-      <w:r>
-        <w:t xml:space="preserve"> int,</w:t>
-      </w:r>
-    </w:p>
-    <w:p>
-      <w:r>
-        <w:tab/>
-        <w:t>foreign key(</w:t>
-      </w:r>
-      <w:proofErr w:type="spellStart"/>
-      <w:r>
-        <w:t>categoryId</w:t>
-      </w:r>
-      <w:proofErr w:type="spellEnd"/>
-      <w:r>
-        <w:t>) references Categories(</w:t>
-      </w:r>
-      <w:proofErr w:type="spellStart"/>
-      <w:r>
-        <w:t>categoryId</w:t>
-      </w:r>
-      <w:proofErr w:type="spellEnd"/>
-      <w:r>
-        <w:t>),</w:t>
-      </w:r>
-    </w:p>
-    <w:p>
-      <w:r>
-        <w:lastRenderedPageBreak/>
-        <w:tab/>
-      </w:r>
-      <w:proofErr w:type="spellStart"/>
-      <w:r>
         <w:t>enrolmentStatus</w:t>
       </w:r>
       <w:proofErr w:type="spellEnd"/>
       <w:r>
-        <w:t xml:space="preserve"> </w:t>
-      </w:r>
-      <w:proofErr w:type="gramStart"/>
-      <w:r>
-        <w:t>varchar(</w:t>
-      </w:r>
-      <w:proofErr w:type="gramEnd"/>
-      <w:r>
-        <w:t>10) not null</w:t>
+        <w:t xml:space="preserve"> varchar(10) not null</w:t>
       </w:r>
     </w:p>
     <w:p>
@@ -2891,13 +2702,8 @@
     <w:p/>
     <w:p>
       <w:r>
-        <w:t xml:space="preserve">create table </w:t>
-      </w:r>
-      <w:proofErr w:type="gramStart"/>
-      <w:r>
-        <w:t>Results(</w:t>
-      </w:r>
-      <w:proofErr w:type="gramEnd"/>
+        <w:t>create table Results(</w:t>
+      </w:r>
     </w:p>
     <w:p>
       <w:r>
@@ -2909,15 +2715,7 @@
       </w:r>
       <w:proofErr w:type="spellEnd"/>
       <w:r>
-        <w:t xml:space="preserve"> int </w:t>
-      </w:r>
-      <w:proofErr w:type="gramStart"/>
-      <w:r>
-        <w:t>identity(</w:t>
-      </w:r>
-      <w:proofErr w:type="gramEnd"/>
-      <w:r>
-        <w:t>1, 1) primary key,</w:t>
+        <w:t xml:space="preserve"> int identity(1, 1) primary key,</w:t>
       </w:r>
     </w:p>
     <w:p>
@@ -2991,41 +2789,94 @@
         <w:pStyle w:val="Heading1"/>
       </w:pPr>
       <w:r>
+        <w:lastRenderedPageBreak/>
         <w:t>Sample Data</w:t>
       </w:r>
     </w:p>
     <w:p>
       <w:r>
+        <w:t>insert into Users(</w:t>
+      </w:r>
+      <w:proofErr w:type="spellStart"/>
+      <w:r>
+        <w:t>firstName</w:t>
+      </w:r>
+      <w:proofErr w:type="spellEnd"/>
+      <w:r>
+        <w:t xml:space="preserve">, </w:t>
+      </w:r>
+      <w:proofErr w:type="spellStart"/>
+      <w:r>
+        <w:t>lastName</w:t>
+      </w:r>
+      <w:proofErr w:type="spellEnd"/>
+      <w:r>
+        <w:t xml:space="preserve">, username, </w:t>
+      </w:r>
+      <w:proofErr w:type="spellStart"/>
+      <w:r>
+        <w:t>emailAddress</w:t>
+      </w:r>
+      <w:proofErr w:type="spellEnd"/>
+      <w:r>
+        <w:t>, password, role)</w:t>
+      </w:r>
+    </w:p>
+    <w:p>
+      <w:r>
+        <w:t>values</w:t>
+      </w:r>
+      <w:r>
+        <w:tab/>
+        <w:t>('Esethu', 'Busakwe', 'esethu@gmail.com', 'HASHED_PASSWORD1', '</w:t>
+      </w:r>
+      <w:proofErr w:type="spellStart"/>
+      <w:r>
+        <w:t>esethub</w:t>
+      </w:r>
+      <w:proofErr w:type="spellEnd"/>
+      <w:r>
+        <w:t xml:space="preserve">', 'Organiser'), </w:t>
+      </w:r>
+    </w:p>
+    <w:p>
+      <w:r>
+        <w:tab/>
+        <w:t>('John','Mokoena','john@gmail.com','HASHED_PASSWORD2','johnm','Organiser'),</w:t>
+      </w:r>
+    </w:p>
+    <w:p>
+      <w:r>
+        <w:tab/>
+        <w:t>('Walter','White','walterw@gmail.com','HASHED_PASSWORD3','wwhite','Participant'),</w:t>
+      </w:r>
+    </w:p>
+    <w:p>
+      <w:r>
+        <w:tab/>
+        <w:t>('Marty','Byrd','martybyrd@gmail.com','HASHED_PASSWORD4','byrdm','Participant');</w:t>
+      </w:r>
+    </w:p>
+    <w:p/>
+    <w:p>
+      <w:r>
         <w:t xml:space="preserve">insert into </w:t>
       </w:r>
-      <w:proofErr w:type="gramStart"/>
-      <w:r>
-        <w:t>Users(</w:t>
-      </w:r>
-      <w:proofErr w:type="spellStart"/>
-      <w:proofErr w:type="gramEnd"/>
-      <w:r>
-        <w:t>firstName</w:t>
-      </w:r>
-      <w:proofErr w:type="spellEnd"/>
-      <w:r>
-        <w:t xml:space="preserve">, </w:t>
-      </w:r>
-      <w:proofErr w:type="spellStart"/>
-      <w:r>
-        <w:t>lastName</w:t>
-      </w:r>
-      <w:proofErr w:type="spellEnd"/>
-      <w:r>
-        <w:t xml:space="preserve">, username, </w:t>
-      </w:r>
-      <w:proofErr w:type="spellStart"/>
-      <w:r>
-        <w:t>emailAddress</w:t>
-      </w:r>
-      <w:proofErr w:type="spellEnd"/>
-      <w:r>
-        <w:t>, password, role)</w:t>
+      <w:proofErr w:type="spellStart"/>
+      <w:r>
+        <w:t>EventTypes</w:t>
+      </w:r>
+      <w:proofErr w:type="spellEnd"/>
+      <w:r>
+        <w:t>(</w:t>
+      </w:r>
+      <w:proofErr w:type="spellStart"/>
+      <w:r>
+        <w:t>eventTypeName</w:t>
+      </w:r>
+      <w:proofErr w:type="spellEnd"/>
+      <w:r>
+        <w:t>)</w:t>
       </w:r>
     </w:p>
     <w:p>
@@ -3034,102 +2885,15 @@
       </w:r>
       <w:r>
         <w:tab/>
-        <w:t>('Esethu', 'Busakwe', 'esethu@gmail.com', 'HASHED_PASSWORD1', '</w:t>
-      </w:r>
-      <w:proofErr w:type="spellStart"/>
-      <w:r>
-        <w:t>esethub</w:t>
-      </w:r>
-      <w:proofErr w:type="spellEnd"/>
-      <w:r>
-        <w:t xml:space="preserve">', 'Organiser'), </w:t>
-      </w:r>
-    </w:p>
-    <w:p>
-      <w:r>
-        <w:lastRenderedPageBreak/>
-        <w:tab/>
-        <w:t>('John','Mokoena</w:t>
-      </w:r>
-      <w:proofErr w:type="gramStart"/>
-      <w:r>
-        <w:t>','john@gmail.com</w:t>
-      </w:r>
-      <w:proofErr w:type="gramEnd"/>
-      <w:r>
-        <w:t>','HASHED_PASSWORD2','johnm','Organiser'),</w:t>
-      </w:r>
-    </w:p>
-    <w:p>
-      <w:r>
-        <w:tab/>
-        <w:t>('Walter','White</w:t>
-      </w:r>
-      <w:proofErr w:type="gramStart"/>
-      <w:r>
-        <w:t>','walterw@gmail.com</w:t>
-      </w:r>
-      <w:proofErr w:type="gramEnd"/>
-      <w:r>
-        <w:t>','HASHED_PASSWORD3','wwhite','Participant'),</w:t>
-      </w:r>
-    </w:p>
-    <w:p>
-      <w:r>
-        <w:tab/>
-        <w:t>('Marty','Byrd</w:t>
-      </w:r>
-      <w:proofErr w:type="gramStart"/>
-      <w:r>
-        <w:t>','martybyrd@gmail.com</w:t>
-      </w:r>
-      <w:proofErr w:type="gramEnd"/>
-      <w:r>
-        <w:t>','HASHED_PASSWORD4','byrdm','Participant');</w:t>
+        <w:t>('Run'), ('Swimming'), ('Cycling'), ('Walk');</w:t>
       </w:r>
     </w:p>
     <w:p/>
     <w:p>
       <w:r>
-        <w:t xml:space="preserve">insert into </w:t>
-      </w:r>
-      <w:proofErr w:type="spellStart"/>
-      <w:r>
-        <w:t>EventTypes</w:t>
-      </w:r>
-      <w:proofErr w:type="spellEnd"/>
-      <w:r>
-        <w:t>(</w:t>
-      </w:r>
-      <w:proofErr w:type="spellStart"/>
-      <w:r>
-        <w:t>eventTypeName</w:t>
-      </w:r>
-      <w:proofErr w:type="spellEnd"/>
-      <w:r>
-        <w:t>)</w:t>
-      </w:r>
-    </w:p>
-    <w:p>
-      <w:r>
-        <w:t>values</w:t>
-      </w:r>
-      <w:r>
-        <w:tab/>
-        <w:t>('Run'), ('Swimming'), ('Cycling'), ('Walk');</w:t>
-      </w:r>
-    </w:p>
-    <w:p/>
-    <w:p>
-      <w:r>
-        <w:t xml:space="preserve">insert into </w:t>
-      </w:r>
-      <w:proofErr w:type="gramStart"/>
-      <w:r>
-        <w:t>Events(</w:t>
-      </w:r>
-      <w:proofErr w:type="spellStart"/>
-      <w:proofErr w:type="gramEnd"/>
+        <w:t>insert into Events(</w:t>
+      </w:r>
+      <w:proofErr w:type="spellStart"/>
       <w:r>
         <w:t>eventName</w:t>
       </w:r>
@@ -3204,14 +2968,9 @@
     </w:p>
     <w:p>
       <w:r>
-        <w:t xml:space="preserve">insert into </w:t>
-      </w:r>
-      <w:proofErr w:type="gramStart"/>
-      <w:r>
-        <w:t>Categories(</w:t>
-      </w:r>
-      <w:proofErr w:type="spellStart"/>
-      <w:proofErr w:type="gramEnd"/>
+        <w:t>insert into Categories(</w:t>
+      </w:r>
+      <w:proofErr w:type="spellStart"/>
       <w:r>
         <w:t>categoryName</w:t>
       </w:r>
@@ -3246,14 +3005,9 @@
     <w:p/>
     <w:p>
       <w:r>
-        <w:t xml:space="preserve">insert into </w:t>
-      </w:r>
-      <w:proofErr w:type="gramStart"/>
-      <w:r>
-        <w:t>Enrolments(</w:t>
-      </w:r>
-      <w:proofErr w:type="spellStart"/>
-      <w:proofErr w:type="gramEnd"/>
+        <w:t>insert into Enrolments(</w:t>
+      </w:r>
+      <w:proofErr w:type="spellStart"/>
       <w:r>
         <w:t>participantId</w:t>
       </w:r>
@@ -3307,6 +3061,7 @@
         <w:pStyle w:val="Heading1"/>
       </w:pPr>
       <w:r>
+        <w:lastRenderedPageBreak/>
         <w:t>References</w:t>
       </w:r>
     </w:p>
@@ -3469,7 +3224,6 @@
     </w:p>
     <w:p>
       <w:r>
-        <w:lastRenderedPageBreak/>
         <w:t xml:space="preserve">Postman Blog (2025) </w:t>
       </w:r>
       <w:r>
@@ -3493,15 +3247,7 @@
           <w:i/>
           <w:iCs/>
         </w:rPr>
-        <w:t xml:space="preserve"> </w:t>
-      </w:r>
-      <w:proofErr w:type="gramStart"/>
-      <w:r>
-        <w:rPr>
-          <w:i/>
-          <w:iCs/>
-        </w:rPr>
-        <w:t>endpoint?</w:t>
+        <w:t xml:space="preserve"> endpoint?</w:t>
       </w:r>
       <w:r>
         <w:rPr>
@@ -3510,7 +3256,6 @@
         </w:rPr>
         <w:t>.</w:t>
       </w:r>
-      <w:proofErr w:type="gramEnd"/>
       <w:r>
         <w:t xml:space="preserve"> Available at: </w:t>
       </w:r>

</xml_diff>